<commit_message>
Inizio working with files
</commit_message>
<xml_diff>
--- a/01.LINUX/02.NavigazioneFileCartelle.docx
+++ b/01.LINUX/02.NavigazioneFileCartelle.docx
@@ -79,23 +79,13 @@
           <w:lang w:val="en-US"/>
         </w:rPr>
       </w:pPr>
-      <w:proofErr w:type="gramStart"/>
       <w:r>
         <w:rPr>
           <w:sz w:val="28"/>
           <w:szCs w:val="28"/>
           <w:lang w:val="en-US"/>
         </w:rPr>
-        <w:t>1 .</w:t>
-      </w:r>
-      <w:proofErr w:type="gramEnd"/>
-      <w:r>
-        <w:rPr>
-          <w:sz w:val="28"/>
-          <w:szCs w:val="28"/>
-          <w:lang w:val="en-US"/>
-        </w:rPr>
-        <w:t xml:space="preserve"> Root directory</w:t>
+        <w:t>1 . Root directory</w:t>
       </w:r>
     </w:p>
     <w:p>
@@ -3183,27 +3173,7 @@
           <w:lang w:val="en-US" w:eastAsia="it-IT"/>
           <w14:ligatures w14:val="none"/>
         </w:rPr>
-        <w:t xml:space="preserve">e </w:t>
-      </w:r>
-      <w:proofErr w:type="spellStart"/>
-      <w:r>
-        <w:rPr>
-          <w:rFonts w:ascii="Times New Roman" w:eastAsia="Times New Roman" w:hAnsi="Times New Roman" w:cs="Times New Roman"/>
-          <w:kern w:val="0"/>
-          <w:lang w:val="en-US" w:eastAsia="it-IT"/>
-          <w14:ligatures w14:val="none"/>
-        </w:rPr>
-        <w:t>anche</w:t>
-      </w:r>
-      <w:proofErr w:type="spellEnd"/>
-      <w:r>
-        <w:rPr>
-          <w:rFonts w:ascii="Times New Roman" w:eastAsia="Times New Roman" w:hAnsi="Times New Roman" w:cs="Times New Roman"/>
-          <w:kern w:val="0"/>
-          <w:lang w:val="en-US" w:eastAsia="it-IT"/>
-          <w14:ligatures w14:val="none"/>
-        </w:rPr>
-        <w:t>:</w:t>
+        <w:t>e anche:</w:t>
       </w:r>
     </w:p>
     <w:p>
@@ -4139,31 +4109,7 @@
           <w:lang w:val="en-US" w:eastAsia="it-IT"/>
           <w14:ligatures w14:val="none"/>
         </w:rPr>
-        <w:t>/</w:t>
-      </w:r>
-      <w:proofErr w:type="spellStart"/>
-      <w:r>
-        <w:rPr>
-          <w:rFonts w:ascii="Courier New" w:eastAsia="Times New Roman" w:hAnsi="Courier New" w:cs="Courier New"/>
-          <w:kern w:val="0"/>
-          <w:sz w:val="20"/>
-          <w:szCs w:val="20"/>
-          <w:lang w:val="en-US" w:eastAsia="it-IT"/>
-          <w14:ligatures w14:val="none"/>
-        </w:rPr>
-        <w:t>usr</w:t>
-      </w:r>
-      <w:proofErr w:type="spellEnd"/>
-      <w:r>
-        <w:rPr>
-          <w:rFonts w:ascii="Courier New" w:eastAsia="Times New Roman" w:hAnsi="Courier New" w:cs="Courier New"/>
-          <w:kern w:val="0"/>
-          <w:sz w:val="20"/>
-          <w:szCs w:val="20"/>
-          <w:lang w:val="en-US" w:eastAsia="it-IT"/>
-          <w14:ligatures w14:val="none"/>
-        </w:rPr>
-        <w:t>/bin/date</w:t>
+        <w:t>/usr/bin/date</w:t>
       </w:r>
     </w:p>
     <w:p>
@@ -4590,31 +4536,7 @@
           <w:lang w:val="en-US" w:eastAsia="it-IT"/>
           <w14:ligatures w14:val="none"/>
         </w:rPr>
-        <w:t>/</w:t>
-      </w:r>
-      <w:proofErr w:type="spellStart"/>
-      <w:r>
-        <w:rPr>
-          <w:rFonts w:ascii="Courier New" w:eastAsia="Times New Roman" w:hAnsi="Courier New" w:cs="Courier New"/>
-          <w:kern w:val="0"/>
-          <w:sz w:val="20"/>
-          <w:szCs w:val="20"/>
-          <w:lang w:val="en-US" w:eastAsia="it-IT"/>
-          <w14:ligatures w14:val="none"/>
-        </w:rPr>
-        <w:t>usr</w:t>
-      </w:r>
-      <w:proofErr w:type="spellEnd"/>
-      <w:r>
-        <w:rPr>
-          <w:rFonts w:ascii="Courier New" w:eastAsia="Times New Roman" w:hAnsi="Courier New" w:cs="Courier New"/>
-          <w:kern w:val="0"/>
-          <w:sz w:val="20"/>
-          <w:szCs w:val="20"/>
-          <w:lang w:val="en-US" w:eastAsia="it-IT"/>
-          <w14:ligatures w14:val="none"/>
-        </w:rPr>
-        <w:t>/bin/date</w:t>
+        <w:t>/usr/bin/date</w:t>
       </w:r>
     </w:p>
     <w:p>
@@ -4713,7 +4635,6 @@
           <w14:ligatures w14:val="none"/>
         </w:rPr>
       </w:pPr>
-      <w:proofErr w:type="spellStart"/>
       <w:r>
         <w:rPr>
           <w:rFonts w:ascii="Times New Roman" w:eastAsia="Times New Roman" w:hAnsi="Times New Roman" w:cs="Times New Roman"/>
@@ -4721,17 +4642,7 @@
           <w:lang w:val="en-US" w:eastAsia="it-IT"/>
           <w14:ligatures w14:val="none"/>
         </w:rPr>
-        <w:t>Cerca</w:t>
-      </w:r>
-      <w:proofErr w:type="spellEnd"/>
-      <w:r>
-        <w:rPr>
-          <w:rFonts w:ascii="Times New Roman" w:eastAsia="Times New Roman" w:hAnsi="Times New Roman" w:cs="Times New Roman"/>
-          <w:kern w:val="0"/>
-          <w:lang w:val="en-US" w:eastAsia="it-IT"/>
-          <w14:ligatures w14:val="none"/>
-        </w:rPr>
-        <w:t xml:space="preserve"> </w:t>
+        <w:t xml:space="preserve">Cerca </w:t>
       </w:r>
       <w:r>
         <w:rPr>
@@ -5135,7 +5046,6 @@
           <w14:ligatures w14:val="none"/>
         </w:rPr>
       </w:pPr>
-      <w:proofErr w:type="spellStart"/>
       <w:r>
         <w:rPr>
           <w:rFonts w:ascii="Times New Roman" w:eastAsia="Times New Roman" w:hAnsi="Times New Roman" w:cs="Times New Roman"/>
@@ -5143,37 +5053,7 @@
           <w:lang w:val="en-US" w:eastAsia="it-IT"/>
           <w14:ligatures w14:val="none"/>
         </w:rPr>
-        <w:t>Ad</w:t>
-      </w:r>
-      <w:proofErr w:type="spellEnd"/>
-      <w:r>
-        <w:rPr>
-          <w:rFonts w:ascii="Times New Roman" w:eastAsia="Times New Roman" w:hAnsi="Times New Roman" w:cs="Times New Roman"/>
-          <w:kern w:val="0"/>
-          <w:lang w:val="en-US" w:eastAsia="it-IT"/>
-          <w14:ligatures w14:val="none"/>
-        </w:rPr>
-        <w:t xml:space="preserve"> </w:t>
-      </w:r>
-      <w:proofErr w:type="spellStart"/>
-      <w:r>
-        <w:rPr>
-          <w:rFonts w:ascii="Times New Roman" w:eastAsia="Times New Roman" w:hAnsi="Times New Roman" w:cs="Times New Roman"/>
-          <w:kern w:val="0"/>
-          <w:lang w:val="en-US" w:eastAsia="it-IT"/>
-          <w14:ligatures w14:val="none"/>
-        </w:rPr>
-        <w:t>esempio</w:t>
-      </w:r>
-      <w:proofErr w:type="spellEnd"/>
-      <w:r>
-        <w:rPr>
-          <w:rFonts w:ascii="Times New Roman" w:eastAsia="Times New Roman" w:hAnsi="Times New Roman" w:cs="Times New Roman"/>
-          <w:kern w:val="0"/>
-          <w:lang w:val="en-US" w:eastAsia="it-IT"/>
-          <w14:ligatures w14:val="none"/>
-        </w:rPr>
-        <w:t>:</w:t>
+        <w:t>Ad esempio:</w:t>
       </w:r>
     </w:p>
     <w:p>
@@ -5215,31 +5095,7 @@
           <w:lang w:val="en-US" w:eastAsia="it-IT"/>
           <w14:ligatures w14:val="none"/>
         </w:rPr>
-        <w:t>PATH=/home/jack1989:/</w:t>
-      </w:r>
-      <w:proofErr w:type="spellStart"/>
-      <w:r>
-        <w:rPr>
-          <w:rFonts w:ascii="Courier New" w:eastAsia="Times New Roman" w:hAnsi="Courier New" w:cs="Courier New"/>
-          <w:kern w:val="0"/>
-          <w:sz w:val="20"/>
-          <w:szCs w:val="20"/>
-          <w:lang w:val="en-US" w:eastAsia="it-IT"/>
-          <w14:ligatures w14:val="none"/>
-        </w:rPr>
-        <w:t>usr</w:t>
-      </w:r>
-      <w:proofErr w:type="spellEnd"/>
-      <w:r>
-        <w:rPr>
-          <w:rFonts w:ascii="Courier New" w:eastAsia="Times New Roman" w:hAnsi="Courier New" w:cs="Courier New"/>
-          <w:kern w:val="0"/>
-          <w:sz w:val="20"/>
-          <w:szCs w:val="20"/>
-          <w:lang w:val="en-US" w:eastAsia="it-IT"/>
-          <w14:ligatures w14:val="none"/>
-        </w:rPr>
-        <w:t>/bin:/bin</w:t>
+        <w:t>PATH=/home/jack1989:/usr/bin:/bin</w:t>
       </w:r>
     </w:p>
     <w:p>
@@ -7773,69 +7629,12 @@
           <w:lang w:val="en-US"/>
         </w:rPr>
       </w:pPr>
-      <w:proofErr w:type="spellStart"/>
       <w:r>
         <w:rPr>
           <w:rStyle w:val="HTMLCode"/>
           <w:lang w:val="en-US"/>
         </w:rPr>
-        <w:t>drwxr</w:t>
-      </w:r>
-      <w:proofErr w:type="spellEnd"/>
-      <w:r>
-        <w:rPr>
-          <w:rStyle w:val="HTMLCode"/>
-          <w:lang w:val="en-US"/>
-        </w:rPr>
-        <w:t>-</w:t>
-      </w:r>
-      <w:proofErr w:type="spellStart"/>
-      <w:r>
-        <w:rPr>
-          <w:rStyle w:val="HTMLCode"/>
-          <w:lang w:val="en-US"/>
-        </w:rPr>
-        <w:t>xr</w:t>
-      </w:r>
-      <w:proofErr w:type="spellEnd"/>
-      <w:r>
-        <w:rPr>
-          <w:rStyle w:val="HTMLCode"/>
-          <w:lang w:val="en-US"/>
-        </w:rPr>
-        <w:t>-</w:t>
-      </w:r>
-      <w:proofErr w:type="gramStart"/>
-      <w:r>
-        <w:rPr>
-          <w:rStyle w:val="HTMLCode"/>
-          <w:lang w:val="en-US"/>
-        </w:rPr>
-        <w:t>x  2</w:t>
-      </w:r>
-      <w:proofErr w:type="gramEnd"/>
-      <w:r>
-        <w:rPr>
-          <w:rStyle w:val="HTMLCode"/>
-          <w:lang w:val="en-US"/>
-        </w:rPr>
-        <w:t xml:space="preserve">  jack1989  </w:t>
-      </w:r>
-      <w:proofErr w:type="spellStart"/>
-      <w:r>
-        <w:rPr>
-          <w:rStyle w:val="HTMLCode"/>
-          <w:lang w:val="en-US"/>
-        </w:rPr>
-        <w:t>jack1989</w:t>
-      </w:r>
-      <w:proofErr w:type="spellEnd"/>
-      <w:r>
-        <w:rPr>
-          <w:rStyle w:val="HTMLCode"/>
-          <w:lang w:val="en-US"/>
-        </w:rPr>
-        <w:t xml:space="preserve">  4096  Aug 3 14:39  Desktop</w:t>
+        <w:t>drwxr-xr-x  2  jack1989  jack1989  4096  Aug 3 14:39  Desktop</w:t>
       </w:r>
     </w:p>
     <w:p>
@@ -8565,61 +8364,126 @@
           <w:lang w:val="en-US"/>
         </w:rPr>
       </w:pPr>
-      <w:proofErr w:type="spellStart"/>
       <w:r>
         <w:rPr>
           <w:rStyle w:val="HTMLCode"/>
           <w:lang w:val="en-US"/>
         </w:rPr>
-        <w:t>drwxr</w:t>
-      </w:r>
-      <w:proofErr w:type="spellEnd"/>
-      <w:r>
-        <w:rPr>
-          <w:rStyle w:val="HTMLCode"/>
-          <w:lang w:val="en-US"/>
-        </w:rPr>
-        <w:t>-</w:t>
-      </w:r>
-      <w:proofErr w:type="spellStart"/>
-      <w:r>
-        <w:rPr>
-          <w:rStyle w:val="HTMLCode"/>
-          <w:lang w:val="en-US"/>
-        </w:rPr>
-        <w:t>xr</w:t>
-      </w:r>
-      <w:proofErr w:type="spellEnd"/>
-      <w:r>
-        <w:rPr>
-          <w:rStyle w:val="HTMLCode"/>
-          <w:lang w:val="en-US"/>
-        </w:rPr>
-        <w:t xml:space="preserve">-x 2 jack1989 </w:t>
-      </w:r>
-      <w:proofErr w:type="spellStart"/>
-      <w:r>
-        <w:rPr>
-          <w:rStyle w:val="HTMLCode"/>
-          <w:lang w:val="en-US"/>
+        <w:t>drwxr-xr-x 2 jack1989 jack1989 4096 Aug 3 14:39 Desktop</w:t>
+      </w:r>
+    </w:p>
+    <w:p>
+      <w:pPr>
+        <w:pStyle w:val="NormalWeb"/>
+      </w:pPr>
+      <w:r>
+        <w:t>come:</w:t>
+      </w:r>
+    </w:p>
+    <w:p>
+      <w:pPr>
+        <w:pStyle w:val="NormalWeb"/>
+      </w:pPr>
+      <w:r>
+        <w:t>«</w:t>
+      </w:r>
+      <w:r>
+        <w:rPr>
+          <w:rStyle w:val="HTMLCode"/>
+        </w:rPr>
+        <w:t>Desktop</w:t>
+      </w:r>
+      <w:r>
+        <w:t xml:space="preserve"> è una </w:t>
+      </w:r>
+      <w:r>
+        <w:rPr>
+          <w:rStyle w:val="Strong"/>
+        </w:rPr>
+        <w:t>directory</w:t>
+      </w:r>
+      <w:r>
+        <w:t xml:space="preserve">, ha determinati </w:t>
+      </w:r>
+      <w:r>
+        <w:rPr>
+          <w:rStyle w:val="Strong"/>
+        </w:rPr>
+        <w:t>permessi</w:t>
+      </w:r>
+      <w:r>
+        <w:t xml:space="preserve">, ha 2 </w:t>
+      </w:r>
+      <w:r>
+        <w:rPr>
+          <w:rStyle w:val="Strong"/>
+        </w:rPr>
+        <w:t>hard link</w:t>
+      </w:r>
+      <w:r>
+        <w:t xml:space="preserve">, appartiene all'utente </w:t>
+      </w:r>
+      <w:r>
+        <w:rPr>
+          <w:rStyle w:val="Strong"/>
         </w:rPr>
         <w:t>jack1989</w:t>
       </w:r>
-      <w:proofErr w:type="spellEnd"/>
-      <w:r>
-        <w:rPr>
-          <w:rStyle w:val="HTMLCode"/>
-          <w:lang w:val="en-US"/>
-        </w:rPr>
-        <w:t xml:space="preserve"> 4096 Aug 3 14:39 Desktop</w:t>
+      <w:r>
+        <w:t xml:space="preserve"> e al gruppo </w:t>
+      </w:r>
+      <w:r>
+        <w:rPr>
+          <w:rStyle w:val="Strong"/>
+        </w:rPr>
+        <w:t>jack1989</w:t>
+      </w:r>
+      <w:r>
+        <w:t xml:space="preserve">, ha dimensione indicata di </w:t>
+      </w:r>
+      <w:r>
+        <w:rPr>
+          <w:rStyle w:val="Strong"/>
+        </w:rPr>
+        <w:t>4096 byte</w:t>
+      </w:r>
+      <w:r>
+        <w:t xml:space="preserve"> ed è stata modificata il </w:t>
+      </w:r>
+      <w:r>
+        <w:rPr>
+          <w:rStyle w:val="Strong"/>
+        </w:rPr>
+        <w:t>3 agosto alle 14:39</w:t>
+      </w:r>
+      <w:r>
+        <w:t>.»</w:t>
       </w:r>
     </w:p>
     <w:p>
       <w:pPr>
         <w:pStyle w:val="NormalWeb"/>
-      </w:pPr>
-      <w:r>
-        <w:t>come:</w:t>
+        <w:rPr>
+          <w:rFonts w:ascii="Segoe UI Emoji" w:hAnsi="Segoe UI Emoji" w:cs="Segoe UI Emoji"/>
+        </w:rPr>
+      </w:pPr>
+      <w:r>
+        <w:t xml:space="preserve">Per i tuoi appunti, però, </w:t>
+      </w:r>
+      <w:r>
+        <w:rPr>
+          <w:rStyle w:val="Strong"/>
+        </w:rPr>
+        <w:t>non approfondirei ancora hard link, gruppi e permessi</w:t>
+      </w:r>
+      <w:r>
+        <w:t xml:space="preserve"> se il corso non li ha spiegati. Sapere cosa rappresentano le colonne è sufficiente: li incontrerai molto meglio quando arriverai ai relativi capitoli. </w:t>
+      </w:r>
+      <w:r>
+        <w:rPr>
+          <w:rFonts w:ascii="Segoe UI Emoji" w:hAnsi="Segoe UI Emoji" w:cs="Segoe UI Emoji"/>
+        </w:rPr>
+        <w:t>🐧</w:t>
       </w:r>
     </w:p>
     <w:p>
@@ -8627,102 +8491,23 @@
         <w:pStyle w:val="NormalWeb"/>
       </w:pPr>
       <w:r>
-        <w:t>«</w:t>
-      </w:r>
-      <w:r>
-        <w:rPr>
-          <w:rStyle w:val="HTMLCode"/>
-        </w:rPr>
-        <w:t>Desktop</w:t>
-      </w:r>
-      <w:r>
-        <w:t xml:space="preserve"> è una </w:t>
-      </w:r>
-      <w:r>
-        <w:rPr>
-          <w:rStyle w:val="Strong"/>
-        </w:rPr>
-        <w:t>directory</w:t>
-      </w:r>
-      <w:r>
-        <w:t xml:space="preserve">, ha determinati </w:t>
-      </w:r>
-      <w:r>
-        <w:rPr>
-          <w:rStyle w:val="Strong"/>
-        </w:rPr>
-        <w:t>permessi</w:t>
-      </w:r>
-      <w:r>
-        <w:t xml:space="preserve">, ha 2 </w:t>
-      </w:r>
-      <w:r>
-        <w:rPr>
-          <w:rStyle w:val="Strong"/>
-        </w:rPr>
-        <w:t>hard link</w:t>
-      </w:r>
-      <w:r>
-        <w:t xml:space="preserve">, appartiene all'utente </w:t>
-      </w:r>
-      <w:r>
-        <w:rPr>
-          <w:rStyle w:val="Strong"/>
-        </w:rPr>
-        <w:t>jack1989</w:t>
-      </w:r>
-      <w:r>
-        <w:t xml:space="preserve"> e al gruppo </w:t>
-      </w:r>
-      <w:r>
-        <w:rPr>
-          <w:rStyle w:val="Strong"/>
-        </w:rPr>
-        <w:t>jack1989</w:t>
-      </w:r>
-      <w:r>
-        <w:t xml:space="preserve">, ha dimensione indicata di </w:t>
-      </w:r>
-      <w:r>
-        <w:rPr>
-          <w:rStyle w:val="Strong"/>
-        </w:rPr>
-        <w:t>4096 byte</w:t>
-      </w:r>
-      <w:r>
-        <w:t xml:space="preserve"> ed è stata modificata il </w:t>
-      </w:r>
-      <w:r>
-        <w:rPr>
-          <w:rStyle w:val="Strong"/>
-        </w:rPr>
-        <w:t>3 agosto alle 14:39</w:t>
-      </w:r>
-      <w:r>
-        <w:t>.»</w:t>
-      </w:r>
-    </w:p>
-    <w:p>
-      <w:pPr>
-        <w:pStyle w:val="NormalWeb"/>
-      </w:pPr>
-      <w:r>
-        <w:t xml:space="preserve">Per i tuoi appunti, però, </w:t>
-      </w:r>
-      <w:r>
-        <w:rPr>
-          <w:rStyle w:val="Strong"/>
-        </w:rPr>
-        <w:t>non approfondirei ancora hard link, gruppi e permessi</w:t>
-      </w:r>
-      <w:r>
-        <w:t xml:space="preserve"> se il corso non li ha spiegati. Sapere cosa rappresentano le colonne è sufficiente: li incontrerai molto meglio quando arriverai ai relativi capitoli. </w:t>
-      </w:r>
-      <w:r>
         <w:rPr>
           <w:rFonts w:ascii="Segoe UI Emoji" w:hAnsi="Segoe UI Emoji" w:cs="Segoe UI Emoji"/>
         </w:rPr>
-        <w:t>🐧</w:t>
+        <w:lastRenderedPageBreak/>
+        <w:t xml:space="preserve">Una di queste colonne rappresenta quindi la dimensione di file e/o cartelle presenti in /home/jack1989. Per quanto riguarda le cartelle, tale dimensione non coincide necessariamente con la somma degli spazi occupati da file e/o cartelle contenuti in /home/jack1989. </w:t>
+      </w:r>
+      <w:r>
+        <w:rPr>
+          <w:rFonts w:ascii="Segoe UI Emoji" w:hAnsi="Segoe UI Emoji" w:cs="Segoe UI Emoji"/>
+        </w:rPr>
+        <w:t>Inoltre, la dimensione delle cartelle contenute in /home/jack1989</w:t>
+      </w:r>
+      <w:r>
+        <w:rPr>
+          <w:rFonts w:ascii="Segoe UI Emoji" w:hAnsi="Segoe UI Emoji" w:cs="Segoe UI Emoji"/>
+        </w:rPr>
+        <w:t xml:space="preserve"> è espressa in byte</w:t>
       </w:r>
     </w:p>
     <w:p>
@@ -8744,7 +8529,6 @@
           <w:sz w:val="28"/>
           <w:szCs w:val="28"/>
         </w:rPr>
-        <w:lastRenderedPageBreak/>
         <w:t>ALL</w:t>
       </w:r>
       <w:r>
@@ -8927,7 +8711,92 @@
           <w:sz w:val="28"/>
           <w:szCs w:val="28"/>
         </w:rPr>
-        <w:t xml:space="preserve">      . In altre parole, con ls da solo i file nascosti non si vedono, mentre con ls -a i file nascosti saranno mostrati.</w:t>
+        <w:t xml:space="preserve">      . In altre parole, con ls da solo i file nascosti non </w:t>
+      </w:r>
+      <w:r>
+        <w:rPr>
+          <w:sz w:val="28"/>
+          <w:szCs w:val="28"/>
+        </w:rPr>
+        <w:lastRenderedPageBreak/>
+        <w:t>si vedono, mentre con ls -a i file nascosti saranno mostrati.</w:t>
+      </w:r>
+      <w:r>
+        <w:rPr>
+          <w:sz w:val="28"/>
+          <w:szCs w:val="28"/>
+        </w:rPr>
+        <w:t xml:space="preserve"> Tra questi file abbiamo anche i file  .  e .., dove . mostra la directory corrente, e .. la parent directory.  Si noti che </w:t>
+      </w:r>
+      <w:r>
+        <w:t>anche nella root</w:t>
+      </w:r>
+      <w:r>
+        <w:t xml:space="preserve"> esistono </w:t>
+      </w:r>
+      <w:r>
+        <w:rPr>
+          <w:rStyle w:val="HTMLCode"/>
+          <w:rFonts w:eastAsiaTheme="minorHAnsi"/>
+        </w:rPr>
+        <w:t>.</w:t>
+      </w:r>
+      <w:r>
+        <w:t xml:space="preserve"> e </w:t>
+      </w:r>
+      <w:r>
+        <w:rPr>
+          <w:rStyle w:val="HTMLCode"/>
+          <w:rFonts w:eastAsiaTheme="minorHAnsi"/>
+        </w:rPr>
+        <w:t>..</w:t>
+      </w:r>
+      <w:r>
+        <w:t xml:space="preserve">, ma da </w:t>
+      </w:r>
+      <w:r>
+        <w:rPr>
+          <w:rStyle w:val="HTMLCode"/>
+          <w:rFonts w:eastAsiaTheme="minorHAnsi"/>
+        </w:rPr>
+        <w:t>/</w:t>
+      </w:r>
+      <w:r>
+        <w:t xml:space="preserve"> anche </w:t>
+      </w:r>
+      <w:r>
+        <w:rPr>
+          <w:rStyle w:val="HTMLCode"/>
+          <w:rFonts w:eastAsiaTheme="minorHAnsi"/>
+        </w:rPr>
+        <w:t>..</w:t>
+      </w:r>
+      <w:r>
+        <w:t xml:space="preserve"> fa riferimento alla root stessa, perché </w:t>
+      </w:r>
+      <w:r>
+        <w:rPr>
+          <w:rStyle w:val="Strong"/>
+        </w:rPr>
+        <w:t xml:space="preserve">sopra </w:t>
+      </w:r>
+      <w:r>
+        <w:rPr>
+          <w:rStyle w:val="HTMLCode"/>
+          <w:rFonts w:eastAsiaTheme="minorHAnsi"/>
+          <w:b/>
+          <w:bCs/>
+        </w:rPr>
+        <w:t>/</w:t>
+      </w:r>
+      <w:r>
+        <w:rPr>
+          <w:rStyle w:val="Strong"/>
+        </w:rPr>
+        <w:t xml:space="preserve"> non esiste un'altra directory</w:t>
+      </w:r>
+      <w:r>
+        <w:t>.</w:t>
       </w:r>
     </w:p>
     <w:p>
@@ -9088,7 +8957,6 @@
           <w:sz w:val="28"/>
           <w:szCs w:val="28"/>
         </w:rPr>
-        <w:lastRenderedPageBreak/>
         <w:drawing>
           <wp:inline distT="0" distB="0" distL="0" distR="0" wp14:anchorId="57AD4B6C" wp14:editId="6615E7C9">
             <wp:extent cx="6120130" cy="4262755"/>
@@ -9630,31 +9498,7 @@
           <w:szCs w:val="28"/>
           <w:lang w:val="en-US"/>
         </w:rPr>
-        <w:t>ABSOLUTE PATH E RELATIVE PATH (</w:t>
-      </w:r>
-      <w:proofErr w:type="spellStart"/>
-      <w:r>
-        <w:rPr>
-          <w:b/>
-          <w:bCs/>
-          <w:color w:val="00B050"/>
-          <w:sz w:val="28"/>
-          <w:szCs w:val="28"/>
-          <w:lang w:val="en-US"/>
-        </w:rPr>
-        <w:t>chatgpt</w:t>
-      </w:r>
-      <w:proofErr w:type="spellEnd"/>
-      <w:r>
-        <w:rPr>
-          <w:b/>
-          <w:bCs/>
-          <w:color w:val="00B050"/>
-          <w:sz w:val="28"/>
-          <w:szCs w:val="28"/>
-          <w:lang w:val="en-US"/>
-        </w:rPr>
-        <w:t>)</w:t>
+        <w:t>ABSOLUTE PATH E RELATIVE PATH (chatgpt)</w:t>
       </w:r>
     </w:p>
     <w:p>
@@ -10165,23 +10009,7 @@
           <w:rStyle w:val="HTMLCode"/>
           <w:lang w:val="en-US"/>
         </w:rPr>
-        <w:t>/</w:t>
-      </w:r>
-      <w:proofErr w:type="spellStart"/>
-      <w:r>
-        <w:rPr>
-          <w:rStyle w:val="HTMLCode"/>
-          <w:lang w:val="en-US"/>
-        </w:rPr>
-        <w:t>usr</w:t>
-      </w:r>
-      <w:proofErr w:type="spellEnd"/>
-      <w:r>
-        <w:rPr>
-          <w:rStyle w:val="HTMLCode"/>
-          <w:lang w:val="en-US"/>
-        </w:rPr>
-        <w:t>/bin</w:t>
+        <w:t>/usr/bin</w:t>
       </w:r>
     </w:p>
     <w:p>
@@ -10556,21 +10384,7 @@
         <w:rPr>
           <w:lang w:val="en-US"/>
         </w:rPr>
-        <w:t xml:space="preserve">E </w:t>
-      </w:r>
-      <w:proofErr w:type="spellStart"/>
-      <w:r>
-        <w:rPr>
-          <w:lang w:val="en-US"/>
-        </w:rPr>
-        <w:t>arrivi</w:t>
-      </w:r>
-      <w:proofErr w:type="spellEnd"/>
-      <w:r>
-        <w:rPr>
-          <w:lang w:val="en-US"/>
-        </w:rPr>
-        <w:t xml:space="preserve"> a:</w:t>
+        <w:t>E arrivi a:</w:t>
       </w:r>
     </w:p>
     <w:p>
@@ -10740,74 +10554,41 @@
           <w:lang w:val="en-US"/>
         </w:rPr>
       </w:pPr>
-      <w:proofErr w:type="spellStart"/>
       <w:r>
         <w:rPr>
           <w:rStyle w:val="HTMLCode"/>
           <w:lang w:val="en-US"/>
         </w:rPr>
-        <w:t>parte</w:t>
-      </w:r>
-      <w:proofErr w:type="spellEnd"/>
-      <w:r>
-        <w:rPr>
-          <w:rStyle w:val="HTMLCode"/>
+        <w:t>parte dalla root /</w:t>
+      </w:r>
+    </w:p>
+    <w:p>
+      <w:pPr>
+        <w:pStyle w:val="HTMLPreformatted"/>
+        <w:rPr>
           <w:lang w:val="en-US"/>
         </w:rPr>
-        <w:t xml:space="preserve"> </w:t>
-      </w:r>
-      <w:proofErr w:type="spellStart"/>
+      </w:pPr>
       <w:r>
         <w:rPr>
           <w:rStyle w:val="HTMLCode"/>
           <w:lang w:val="en-US"/>
         </w:rPr>
-        <w:t>dalla</w:t>
-      </w:r>
-      <w:proofErr w:type="spellEnd"/>
-      <w:r>
-        <w:rPr>
-          <w:rStyle w:val="HTMLCode"/>
+        <w:t>= ABSOLUTE PATH</w:t>
+      </w:r>
+    </w:p>
+    <w:p>
+      <w:pPr>
+        <w:pStyle w:val="NormalWeb"/>
+        <w:rPr>
           <w:lang w:val="en-US"/>
         </w:rPr>
-        <w:t xml:space="preserve"> root /</w:t>
-      </w:r>
-    </w:p>
-    <w:p>
-      <w:pPr>
-        <w:pStyle w:val="HTMLPreformatted"/>
+      </w:pPr>
+      <w:r>
         <w:rPr>
           <w:lang w:val="en-US"/>
         </w:rPr>
-      </w:pPr>
-      <w:r>
-        <w:rPr>
-          <w:rStyle w:val="HTMLCode"/>
-          <w:lang w:val="en-US"/>
-        </w:rPr>
-        <w:t>= ABSOLUTE PATH</w:t>
-      </w:r>
-    </w:p>
-    <w:p>
-      <w:pPr>
-        <w:pStyle w:val="NormalWeb"/>
-        <w:rPr>
-          <w:lang w:val="en-US"/>
-        </w:rPr>
-      </w:pPr>
-      <w:proofErr w:type="spellStart"/>
-      <w:r>
-        <w:rPr>
-          <w:lang w:val="en-US"/>
-        </w:rPr>
-        <w:t>mentre</w:t>
-      </w:r>
-      <w:proofErr w:type="spellEnd"/>
-      <w:r>
-        <w:rPr>
-          <w:lang w:val="en-US"/>
-        </w:rPr>
-        <w:t>:</w:t>
+        <w:t>mentre:</w:t>
       </w:r>
     </w:p>
     <w:p>
@@ -11048,21 +10829,7 @@
         <w:rPr>
           <w:lang w:val="en-US"/>
         </w:rPr>
-        <w:t xml:space="preserve">e </w:t>
-      </w:r>
-      <w:proofErr w:type="spellStart"/>
-      <w:r>
-        <w:rPr>
-          <w:lang w:val="en-US"/>
-        </w:rPr>
-        <w:t>fai</w:t>
-      </w:r>
-      <w:proofErr w:type="spellEnd"/>
-      <w:r>
-        <w:rPr>
-          <w:lang w:val="en-US"/>
-        </w:rPr>
-        <w:t>:</w:t>
+        <w:t>e fai:</w:t>
       </w:r>
     </w:p>
     <w:p>
@@ -11079,7 +10846,6 @@
         </w:rPr>
         <w:t>cd</w:t>
       </w:r>
-      <w:proofErr w:type="gramStart"/>
       <w:r>
         <w:rPr>
           <w:rStyle w:val="HTMLCode"/>
@@ -11087,7 +10853,6 @@
         </w:rPr>
         <w:t xml:space="preserve"> ..</w:t>
       </w:r>
-      <w:proofErr w:type="gramEnd"/>
     </w:p>
     <w:p>
       <w:pPr>
@@ -11096,19 +10861,11 @@
           <w:lang w:val="en-US"/>
         </w:rPr>
       </w:pPr>
-      <w:proofErr w:type="spellStart"/>
       <w:r>
         <w:rPr>
           <w:lang w:val="en-US"/>
         </w:rPr>
-        <w:t>vai</w:t>
-      </w:r>
-      <w:proofErr w:type="spellEnd"/>
-      <w:r>
-        <w:rPr>
-          <w:lang w:val="en-US"/>
-        </w:rPr>
-        <w:t xml:space="preserve"> in:</w:t>
+        <w:t>vai in:</w:t>
       </w:r>
     </w:p>
     <w:p>
@@ -12210,19 +11967,11 @@
           <w:lang w:val="en-US"/>
         </w:rPr>
       </w:pPr>
-      <w:proofErr w:type="spellStart"/>
       <w:r>
         <w:rPr>
           <w:lang w:val="en-US"/>
         </w:rPr>
-        <w:t>allora</w:t>
-      </w:r>
-      <w:proofErr w:type="spellEnd"/>
-      <w:r>
-        <w:rPr>
-          <w:lang w:val="en-US"/>
-        </w:rPr>
-        <w:t>:</w:t>
+        <w:t>allora:</w:t>
       </w:r>
     </w:p>
     <w:p>
@@ -12414,19 +12163,11 @@
           <w:lang w:val="en-US"/>
         </w:rPr>
       </w:pPr>
-      <w:proofErr w:type="spellStart"/>
       <w:r>
         <w:rPr>
           <w:lang w:val="en-US"/>
         </w:rPr>
-        <w:t>Quindi</w:t>
-      </w:r>
-      <w:proofErr w:type="spellEnd"/>
-      <w:r>
-        <w:rPr>
-          <w:lang w:val="en-US"/>
-        </w:rPr>
-        <w:t>:</w:t>
+        <w:t>Quindi:</w:t>
       </w:r>
     </w:p>
     <w:p>
@@ -12927,39 +12668,7 @@
           <w:rStyle w:val="HTMLCode"/>
           <w:lang w:val="en-US"/>
         </w:rPr>
-        <w:t xml:space="preserve">   </w:t>
-      </w:r>
-      <w:proofErr w:type="spellStart"/>
-      <w:r>
-        <w:rPr>
-          <w:rStyle w:val="HTMLCode"/>
-          <w:lang w:val="en-US"/>
-        </w:rPr>
-        <w:t>parte</w:t>
-      </w:r>
-      <w:proofErr w:type="spellEnd"/>
-      <w:r>
-        <w:rPr>
-          <w:rStyle w:val="HTMLCode"/>
-          <w:lang w:val="en-US"/>
-        </w:rPr>
-        <w:t xml:space="preserve"> </w:t>
-      </w:r>
-      <w:proofErr w:type="spellStart"/>
-      <w:r>
-        <w:rPr>
-          <w:rStyle w:val="HTMLCode"/>
-          <w:lang w:val="en-US"/>
-        </w:rPr>
-        <w:t>dalla</w:t>
-      </w:r>
-      <w:proofErr w:type="spellEnd"/>
-      <w:r>
-        <w:rPr>
-          <w:rStyle w:val="HTMLCode"/>
-          <w:lang w:val="en-US"/>
-        </w:rPr>
-        <w:t xml:space="preserve"> DIRECTORY CORRENTE</w:t>
+        <w:t xml:space="preserve">   parte dalla DIRECTORY CORRENTE</w:t>
       </w:r>
     </w:p>
     <w:p>
@@ -13126,51 +12835,27 @@
           <w:lang w:val="en-US"/>
         </w:rPr>
       </w:pPr>
-      <w:proofErr w:type="spellStart"/>
       <w:r>
         <w:rPr>
           <w:lang w:val="en-US"/>
         </w:rPr>
-        <w:t>hai</w:t>
-      </w:r>
-      <w:proofErr w:type="spellEnd"/>
-      <w:r>
-        <w:rPr>
+        <w:t>hai:</w:t>
+      </w:r>
+    </w:p>
+    <w:p>
+      <w:pPr>
+        <w:pStyle w:val="HTMLPreformatted"/>
+        <w:rPr>
+          <w:rStyle w:val="HTMLCode"/>
           <w:lang w:val="en-US"/>
         </w:rPr>
-        <w:t>:</w:t>
-      </w:r>
-    </w:p>
-    <w:p>
-      <w:pPr>
-        <w:pStyle w:val="HTMLPreformatted"/>
+      </w:pPr>
+      <w:r>
         <w:rPr>
           <w:rStyle w:val="HTMLCode"/>
           <w:lang w:val="en-US"/>
         </w:rPr>
-      </w:pPr>
-      <w:r>
-        <w:rPr>
-          <w:rStyle w:val="HTMLCode"/>
-          <w:lang w:val="en-US"/>
-        </w:rPr>
-        <w:t xml:space="preserve">directory </w:t>
-      </w:r>
-      <w:proofErr w:type="spellStart"/>
-      <w:r>
-        <w:rPr>
-          <w:rStyle w:val="HTMLCode"/>
-          <w:lang w:val="en-US"/>
-        </w:rPr>
-        <w:t>corrente</w:t>
-      </w:r>
-      <w:proofErr w:type="spellEnd"/>
-      <w:r>
-        <w:rPr>
-          <w:rStyle w:val="HTMLCode"/>
-          <w:lang w:val="en-US"/>
-        </w:rPr>
-        <w:t xml:space="preserve"> = /home/jack1989/Documents</w:t>
+        <w:t>directory corrente = /home/jack1989/Documents</w:t>
       </w:r>
     </w:p>
     <w:p>
@@ -13565,21 +13250,12 @@
           <w:lang w:val="en-US"/>
         </w:rPr>
       </w:pPr>
-      <w:proofErr w:type="spellStart"/>
       <w:r>
         <w:rPr>
           <w:lang w:val="en-US"/>
         </w:rPr>
-        <w:t>Quindi</w:t>
-      </w:r>
-      <w:proofErr w:type="spellEnd"/>
-      <w:r>
-        <w:rPr>
-          <w:lang w:val="en-US"/>
-        </w:rPr>
-        <w:t xml:space="preserve"> </w:t>
-      </w:r>
-      <w:proofErr w:type="spellStart"/>
+        <w:t xml:space="preserve">Quindi </w:t>
+      </w:r>
       <w:r>
         <w:rPr>
           <w:rStyle w:val="Strong"/>
@@ -13587,7 +13263,6 @@
         </w:rPr>
         <w:t>attenzione</w:t>
       </w:r>
-      <w:proofErr w:type="spellEnd"/>
       <w:r>
         <w:rPr>
           <w:lang w:val="en-US"/>
@@ -13608,23 +13283,7 @@
           <w:rStyle w:val="HTMLCode"/>
           <w:lang w:val="en-US"/>
         </w:rPr>
-        <w:t xml:space="preserve">Directory </w:t>
-      </w:r>
-      <w:proofErr w:type="spellStart"/>
-      <w:r>
-        <w:rPr>
-          <w:rStyle w:val="HTMLCode"/>
-          <w:lang w:val="en-US"/>
-        </w:rPr>
-        <w:t>corrente</w:t>
-      </w:r>
-      <w:proofErr w:type="spellEnd"/>
-      <w:r>
-        <w:rPr>
-          <w:rStyle w:val="HTMLCode"/>
-          <w:lang w:val="en-US"/>
-        </w:rPr>
-        <w:t xml:space="preserve"> = /home/jack1989/Downloads</w:t>
+        <w:t>Directory corrente = /home/jack1989/Downloads</w:t>
       </w:r>
     </w:p>
     <w:p>
@@ -13979,21 +13638,7 @@
         <w:rPr>
           <w:lang w:val="en-US"/>
         </w:rPr>
-        <w:t xml:space="preserve">Se </w:t>
-      </w:r>
-      <w:proofErr w:type="spellStart"/>
-      <w:r>
-        <w:rPr>
-          <w:lang w:val="en-US"/>
-        </w:rPr>
-        <w:t>siamo</w:t>
-      </w:r>
-      <w:proofErr w:type="spellEnd"/>
-      <w:r>
-        <w:rPr>
-          <w:lang w:val="en-US"/>
-        </w:rPr>
-        <w:t xml:space="preserve"> in:</w:t>
+        <w:t>Se siamo in:</w:t>
       </w:r>
     </w:p>
     <w:p>
@@ -14362,86 +14007,55 @@
           <w:lang w:val="en-US"/>
         </w:rPr>
       </w:pPr>
-      <w:proofErr w:type="spellStart"/>
       <w:r>
         <w:rPr>
           <w:lang w:val="en-US"/>
         </w:rPr>
-        <w:t>Partiamo</w:t>
-      </w:r>
-      <w:proofErr w:type="spellEnd"/>
-      <w:r>
+        <w:t>Partiamo da:</w:t>
+      </w:r>
+    </w:p>
+    <w:p>
+      <w:pPr>
+        <w:pStyle w:val="HTMLPreformatted"/>
         <w:rPr>
           <w:lang w:val="en-US"/>
         </w:rPr>
-        <w:t xml:space="preserve"> da:</w:t>
-      </w:r>
-    </w:p>
-    <w:p>
-      <w:pPr>
-        <w:pStyle w:val="HTMLPreformatted"/>
-        <w:rPr>
+      </w:pPr>
+      <w:r>
+        <w:rPr>
+          <w:rStyle w:val="HTMLCode"/>
           <w:lang w:val="en-US"/>
         </w:rPr>
-      </w:pPr>
-      <w:r>
-        <w:rPr>
-          <w:rStyle w:val="HTMLCode"/>
+        <w:t>/home/jack1989/Downloads</w:t>
+      </w:r>
+    </w:p>
+    <w:p>
+      <w:pPr>
+        <w:pStyle w:val="NormalWeb"/>
+        <w:rPr>
           <w:lang w:val="en-US"/>
         </w:rPr>
-        <w:t>/home/jack1989/Downloads</w:t>
-      </w:r>
-    </w:p>
-    <w:p>
-      <w:pPr>
-        <w:pStyle w:val="NormalWeb"/>
-        <w:rPr>
+      </w:pPr>
+      <w:r>
+        <w:rPr>
+          <w:rStyle w:val="HTMLCode"/>
           <w:lang w:val="en-US"/>
         </w:rPr>
-      </w:pPr>
-      <w:r>
-        <w:rPr>
-          <w:rStyle w:val="HTMLCode"/>
+        <w:t>..</w:t>
+      </w:r>
+      <w:r>
+        <w:rPr>
           <w:lang w:val="en-US"/>
         </w:rPr>
-        <w:t>..</w:t>
-      </w:r>
-      <w:r>
-        <w:rPr>
-          <w:lang w:val="en-US"/>
-        </w:rPr>
-        <w:t xml:space="preserve"> </w:t>
-      </w:r>
-      <w:proofErr w:type="spellStart"/>
-      <w:r>
-        <w:rPr>
-          <w:lang w:val="en-US"/>
-        </w:rPr>
-        <w:t>significa</w:t>
-      </w:r>
-      <w:proofErr w:type="spellEnd"/>
-      <w:r>
-        <w:rPr>
-          <w:lang w:val="en-US"/>
-        </w:rPr>
-        <w:t xml:space="preserve"> </w:t>
+        <w:t xml:space="preserve"> significa </w:t>
       </w:r>
       <w:r>
         <w:rPr>
           <w:rStyle w:val="Emphasis"/>
           <w:lang w:val="en-US"/>
         </w:rPr>
-        <w:t xml:space="preserve">directory </w:t>
-      </w:r>
-      <w:proofErr w:type="spellStart"/>
-      <w:r>
-        <w:rPr>
-          <w:rStyle w:val="Emphasis"/>
-          <w:lang w:val="en-US"/>
-        </w:rPr>
-        <w:t>genitore</w:t>
-      </w:r>
-      <w:proofErr w:type="spellEnd"/>
+        <w:t>directory genitore</w:t>
+      </w:r>
       <w:r>
         <w:rPr>
           <w:lang w:val="en-US"/>
@@ -14556,19 +14170,11 @@
           <w:lang w:val="en-US"/>
         </w:rPr>
       </w:pPr>
-      <w:proofErr w:type="spellStart"/>
       <w:r>
         <w:rPr>
           <w:lang w:val="en-US"/>
         </w:rPr>
-        <w:t>ottenendo</w:t>
-      </w:r>
-      <w:proofErr w:type="spellEnd"/>
-      <w:r>
-        <w:rPr>
-          <w:lang w:val="en-US"/>
-        </w:rPr>
-        <w:t>:</w:t>
+        <w:t>ottenendo:</w:t>
       </w:r>
     </w:p>
     <w:p>
@@ -15029,6 +14635,7 @@
       </w:pPr>
       <w:r>
         <w:rPr>
+          <w:noProof/>
           <w:sz w:val="28"/>
           <w:szCs w:val="28"/>
         </w:rPr>
@@ -15134,6 +14741,7 @@
       </w:pPr>
       <w:r>
         <w:rPr>
+          <w:noProof/>
           <w:sz w:val="28"/>
           <w:szCs w:val="28"/>
         </w:rPr>
@@ -15245,9 +14853,12 @@
           <w:sz w:val="28"/>
           <w:szCs w:val="28"/>
         </w:rPr>
-        <w:t xml:space="preserve">CARTELLA </w:t>
-      </w:r>
-      <w:r>
+        <w:t>CARTELLA etc</w:t>
+      </w:r>
+    </w:p>
+    <w:p>
+      <w:pPr>
+        <w:jc w:val="center"/>
         <w:rPr>
           <w:b/>
           <w:bCs/>
@@ -15255,19 +14866,6 @@
           <w:sz w:val="28"/>
           <w:szCs w:val="28"/>
         </w:rPr>
-        <w:t>etc</w:t>
-      </w:r>
-    </w:p>
-    <w:p>
-      <w:pPr>
-        <w:jc w:val="center"/>
-        <w:rPr>
-          <w:b/>
-          <w:bCs/>
-          <w:color w:val="D86DCB" w:themeColor="accent5" w:themeTint="99"/>
-          <w:sz w:val="28"/>
-          <w:szCs w:val="28"/>
-        </w:rPr>
       </w:pPr>
     </w:p>
     <w:p>
@@ -15308,6 +14906,7 @@
       </w:pPr>
       <w:r>
         <w:rPr>
+          <w:noProof/>
           <w:sz w:val="28"/>
           <w:szCs w:val="28"/>
         </w:rPr>
@@ -17593,9 +17192,27 @@
           <w:sz w:val="28"/>
           <w:szCs w:val="28"/>
         </w:rPr>
-        <w:t xml:space="preserve">CARTELLA </w:t>
-      </w:r>
-      <w:r>
+        <w:t>CARTELLA media</w:t>
+      </w:r>
+    </w:p>
+    <w:p>
+      <w:pPr>
+        <w:rPr>
+          <w:sz w:val="28"/>
+          <w:szCs w:val="28"/>
+        </w:rPr>
+      </w:pPr>
+      <w:r>
+        <w:rPr>
+          <w:sz w:val="28"/>
+          <w:szCs w:val="28"/>
+        </w:rPr>
+        <w:t>Torniamo alla cartella root con  con “cd /” e poi “ls -la”, ed entriamo nella cartella “media”.</w:t>
+      </w:r>
+    </w:p>
+    <w:p>
+      <w:pPr>
+        <w:jc w:val="center"/>
         <w:rPr>
           <w:b/>
           <w:bCs/>
@@ -17603,39 +17220,12 @@
           <w:sz w:val="28"/>
           <w:szCs w:val="28"/>
         </w:rPr>
-        <w:t>media</w:t>
-      </w:r>
-    </w:p>
-    <w:p>
-      <w:pPr>
-        <w:rPr>
-          <w:sz w:val="28"/>
-          <w:szCs w:val="28"/>
-        </w:rPr>
-      </w:pPr>
-      <w:r>
-        <w:rPr>
-          <w:sz w:val="28"/>
-          <w:szCs w:val="28"/>
-        </w:rPr>
-        <w:t>Torniamo alla cartella root con  con “cd /” e poi “ls -la”, ed entriamo nella cartella “media”.</w:t>
-      </w:r>
-    </w:p>
-    <w:p>
-      <w:pPr>
-        <w:jc w:val="center"/>
+      </w:pPr>
+      <w:r>
         <w:rPr>
           <w:b/>
           <w:bCs/>
-          <w:color w:val="D86DCB" w:themeColor="accent5" w:themeTint="99"/>
-          <w:sz w:val="28"/>
-          <w:szCs w:val="28"/>
-        </w:rPr>
-      </w:pPr>
-      <w:r>
-        <w:rPr>
-          <w:b/>
-          <w:bCs/>
+          <w:noProof/>
           <w:color w:val="D86DCB" w:themeColor="accent5" w:themeTint="99"/>
           <w:sz w:val="28"/>
           <w:szCs w:val="28"/>
@@ -18181,90 +17771,19 @@
         <w:rPr>
           <w:lang w:val="en-US"/>
         </w:rPr>
-        <w:t xml:space="preserve">Nel </w:t>
-      </w:r>
-      <w:proofErr w:type="spellStart"/>
-      <w:r>
-        <w:rPr>
+        <w:t>Nel tuo screenshot compare:</w:t>
+      </w:r>
+    </w:p>
+    <w:p>
+      <w:pPr>
+        <w:pStyle w:val="HTMLPreformatted"/>
+      </w:pPr>
+      <w:r>
+        <w:rPr>
+          <w:rStyle w:val="HTMLCode"/>
           <w:lang w:val="en-US"/>
         </w:rPr>
-        <w:t>tuo</w:t>
-      </w:r>
-      <w:proofErr w:type="spellEnd"/>
-      <w:r>
-        <w:rPr>
-          <w:lang w:val="en-US"/>
-        </w:rPr>
-        <w:t xml:space="preserve"> screenshot compare:</w:t>
-      </w:r>
-    </w:p>
-    <w:p>
-      <w:pPr>
-        <w:pStyle w:val="HTMLPreformatted"/>
-      </w:pPr>
-      <w:proofErr w:type="spellStart"/>
-      <w:r>
-        <w:rPr>
-          <w:rStyle w:val="HTMLCode"/>
-          <w:lang w:val="en-US"/>
-        </w:rPr>
-        <w:t>dr</w:t>
-      </w:r>
-      <w:proofErr w:type="spellEnd"/>
-      <w:r>
-        <w:rPr>
-          <w:rStyle w:val="HTMLCode"/>
-          <w:lang w:val="en-US"/>
-        </w:rPr>
-        <w:t>-</w:t>
-      </w:r>
-      <w:proofErr w:type="spellStart"/>
-      <w:r>
-        <w:rPr>
-          <w:rStyle w:val="HTMLCode"/>
-          <w:lang w:val="en-US"/>
-        </w:rPr>
-        <w:t>xr</w:t>
-      </w:r>
-      <w:proofErr w:type="spellEnd"/>
-      <w:r>
-        <w:rPr>
-          <w:rStyle w:val="HTMLCode"/>
-          <w:lang w:val="en-US"/>
-        </w:rPr>
-        <w:t>-</w:t>
-      </w:r>
-      <w:proofErr w:type="spellStart"/>
-      <w:r>
-        <w:rPr>
-          <w:rStyle w:val="HTMLCode"/>
-          <w:lang w:val="en-US"/>
-        </w:rPr>
-        <w:t>xr</w:t>
-      </w:r>
-      <w:proofErr w:type="spellEnd"/>
-      <w:r>
-        <w:rPr>
-          <w:rStyle w:val="HTMLCode"/>
-          <w:lang w:val="en-US"/>
-        </w:rPr>
-        <w:t xml:space="preserve">-x 1 jack1989 </w:t>
-      </w:r>
-      <w:proofErr w:type="spellStart"/>
-      <w:r>
-        <w:rPr>
-          <w:rStyle w:val="HTMLCode"/>
-          <w:lang w:val="en-US"/>
-        </w:rPr>
-        <w:t>jack1989</w:t>
-      </w:r>
-      <w:proofErr w:type="spellEnd"/>
-      <w:r>
-        <w:rPr>
-          <w:rStyle w:val="HTMLCode"/>
-          <w:lang w:val="en-US"/>
-        </w:rPr>
-        <w:t xml:space="preserve"> 2048 ... </w:t>
+        <w:t xml:space="preserve">dr-xr-xr-x 1 jack1989 jack1989 2048 ... </w:t>
       </w:r>
       <w:r>
         <w:rPr>
@@ -18467,9 +17986,12 @@
           <w:sz w:val="28"/>
           <w:szCs w:val="28"/>
         </w:rPr>
-        <w:t xml:space="preserve">CARTELLA </w:t>
-      </w:r>
-      <w:r>
+        <w:t>CARTELLA var</w:t>
+      </w:r>
+    </w:p>
+    <w:p>
+      <w:pPr>
+        <w:jc w:val="center"/>
         <w:rPr>
           <w:b/>
           <w:bCs/>
@@ -18477,12 +17999,10 @@
           <w:sz w:val="28"/>
           <w:szCs w:val="28"/>
         </w:rPr>
-        <w:t>var</w:t>
-      </w:r>
-    </w:p>
-    <w:p>
-      <w:pPr>
-        <w:jc w:val="center"/>
+      </w:pPr>
+    </w:p>
+    <w:p>
+      <w:pPr>
         <w:rPr>
           <w:b/>
           <w:bCs/>
@@ -18491,21 +18011,11 @@
           <w:szCs w:val="28"/>
         </w:rPr>
       </w:pPr>
-    </w:p>
-    <w:p>
-      <w:pPr>
+      <w:r>
         <w:rPr>
           <w:b/>
           <w:bCs/>
-          <w:color w:val="D86DCB" w:themeColor="accent5" w:themeTint="99"/>
-          <w:sz w:val="28"/>
-          <w:szCs w:val="28"/>
-        </w:rPr>
-      </w:pPr>
-      <w:r>
-        <w:rPr>
-          <w:b/>
-          <w:bCs/>
+          <w:noProof/>
           <w:color w:val="D86DCB" w:themeColor="accent5" w:themeTint="99"/>
           <w:sz w:val="28"/>
           <w:szCs w:val="28"/>

</xml_diff>